<commit_message>
Update tech stack: React Native → Flutter, Next.js → React.js (Next.js)
Changed mobile app framework from React Native to Flutter (Dart) across
all sections. Updated website/web app references to React.js (Next.js 14)
throughout the proposal including tech stack table, sprint plan, team
roles, and feature descriptions.

https://claude.ai/code/session_01WQuCBGtMUv6t4K2ScLL4px
</commit_message>
<xml_diff>
--- a/YAARL360_Proposal_39L.docx
+++ b/YAARL360_Proposal_39L.docx
@@ -325,7 +325,7 @@
           <w:color w:val="111827"/>
           <w:sz w:val="20"/>
         </w:rPr>
-        <w:t>Customer App (iOS &amp; Android — React Native)</w:t>
+        <w:t>Customer App (iOS &amp; Android — Flutter)</w:t>
       </w:r>
     </w:p>
     <w:p>
@@ -338,7 +338,7 @@
           <w:color w:val="111827"/>
           <w:sz w:val="20"/>
         </w:rPr>
-        <w:t>Worker / Partner App (iOS &amp; Android — React Native)</w:t>
+        <w:t>Worker / Partner App (iOS &amp; Android — Flutter)</w:t>
       </w:r>
     </w:p>
     <w:p>
@@ -351,7 +351,7 @@
           <w:color w:val="111827"/>
           <w:sz w:val="20"/>
         </w:rPr>
-        <w:t>Core Marketing &amp; Subscription Website (Next.js 14)</w:t>
+        <w:t>Core Marketing &amp; Subscription Website (React.js (Next.js 14))</w:t>
       </w:r>
     </w:p>
     <w:p>
@@ -364,7 +364,7 @@
           <w:color w:val="111827"/>
           <w:sz w:val="20"/>
         </w:rPr>
-        <w:t>Super Admin Command Center (Next.js + Node.js)</w:t>
+        <w:t>Super Admin Command Center (React.js (Next.js) + Node.js)</w:t>
       </w:r>
     </w:p>
     <w:p/>
@@ -713,7 +713,7 @@
           <w:color w:val="111827"/>
           <w:sz w:val="20"/>
         </w:rPr>
-        <w:t>The platform is built on a unified JavaScript/TypeScript ecosystem — Next.js on all web surfaces and React Native on mobile — sharing business logic, type definitions, and UI components across all four products via a monorepo.</w:t>
+        <w:t>The platform is built on a unified JavaScript/TypeScript ecosystem — React.js (Next.js) on all web surfaces and Flutter on mobile — sharing business logic, type definitions, and UI components across all four products via a monorepo.</w:t>
       </w:r>
     </w:p>
     <w:tbl>
@@ -820,7 +820,7 @@
                 <w:color w:val="111827"/>
                 <w:sz w:val="18"/>
               </w:rPr>
-              <w:t>React Native (Expo)</w:t>
+              <w:t>Flutter (Dart)</w:t>
             </w:r>
           </w:p>
         </w:tc>
@@ -838,7 +838,7 @@
                 <w:color w:val="111827"/>
                 <w:sz w:val="18"/>
               </w:rPr>
-              <w:t>Shared JS codebase for iOS &amp; Android. 90% code reuse between customer and worker apps.</w:t>
+              <w:t>Single Dart codebase for iOS &amp; Android. High code reuse between customer and worker apps.</w:t>
             </w:r>
           </w:p>
         </w:tc>
@@ -876,7 +876,7 @@
                 <w:color w:val="111827"/>
                 <w:sz w:val="18"/>
               </w:rPr>
-              <w:t>Next.js 14 (App Router + SSR)</w:t>
+              <w:t>React.js with SSR via Next.js</w:t>
             </w:r>
           </w:p>
         </w:tc>
@@ -894,7 +894,7 @@
                 <w:color w:val="111827"/>
                 <w:sz w:val="18"/>
               </w:rPr>
-              <w:t>SSR required for sub-1.5s load and Google SEO ranking. ISR for geo landing pages.</w:t>
+              <w:t>SSR via Next.js required for sub-1.5s load and Google SEO ranking. ISR for geo landing pages.</w:t>
             </w:r>
           </w:p>
         </w:tc>
@@ -932,7 +932,7 @@
                 <w:color w:val="111827"/>
                 <w:sz w:val="18"/>
               </w:rPr>
-              <w:t>Next.js 14 + React</w:t>
+              <w:t>React.js (Next.js 14) + React</w:t>
             </w:r>
           </w:p>
         </w:tc>
@@ -1566,7 +1566,7 @@
                 <w:color w:val="111827"/>
                 <w:sz w:val="18"/>
               </w:rPr>
-              <w:t>Global CDN for Next.js. Railway for Node.js + PostgreSQL.</w:t>
+              <w:t>Global CDN for React.js (Next.js). Railway for Node.js + PostgreSQL.</w:t>
             </w:r>
           </w:p>
         </w:tc>
@@ -3006,7 +3006,7 @@
           <w:color w:val="111827"/>
           <w:sz w:val="32"/>
         </w:rPr>
-        <w:t>3.4  Core Website — Next.js 14</w:t>
+        <w:t>3.4  Core Website — React.js (Next.js 14)</w:t>
       </w:r>
     </w:p>
     <w:p>
@@ -3834,7 +3834,7 @@
                 <w:color w:val="111827"/>
                 <w:sz w:val="18"/>
               </w:rPr>
-              <w:t>React Native customer app: onboarding, on-demand booking, live map, scheduled booking, subscription dashboard, payment flow, push notifications, ratings, job history</w:t>
+              <w:t>Flutter customer app: onboarding, on-demand booking, live map, scheduled booking, subscription dashboard, payment flow, push notifications, ratings, job history</w:t>
             </w:r>
           </w:p>
         </w:tc>
@@ -3910,7 +3910,7 @@
                 <w:color w:val="111827"/>
                 <w:sz w:val="18"/>
               </w:rPr>
-              <w:t>React Native worker app: online/offline toggle, job radar, 30s dispatch timer, in-house shift roster, GPS check-in/out, earnings dashboard, proof-of-work upload</w:t>
+              <w:t>Flutter worker app: online/offline toggle, job radar, 30s dispatch timer, in-house shift roster, GPS check-in/out, earnings dashboard, proof-of-work upload</w:t>
             </w:r>
           </w:p>
         </w:tc>
@@ -3986,7 +3986,7 @@
                 <w:color w:val="111827"/>
                 <w:sz w:val="18"/>
               </w:rPr>
-              <w:t>Next.js 14 website: homepage, city validator, service matrix, subscription checkout, B2B portal, gig worker funnel, geo SEO page generator, GA4 tracking, Lighthouse CI</w:t>
+              <w:t>React.js (Next.js 14) website: homepage, city validator, service matrix, subscription checkout, B2B portal, gig worker funnel, geo SEO page generator, GA4 tracking, Lighthouse CI</w:t>
             </w:r>
           </w:p>
         </w:tc>
@@ -4373,7 +4373,7 @@
                 <w:color w:val="111827"/>
                 <w:sz w:val="18"/>
               </w:rPr>
-              <w:t>React Native Customer App: onboarding, home screen, on-demand booking flow, map screen. Socket.io WebSocket server for live dispatch events.</w:t>
+              <w:t>Flutter Customer App: onboarding, home screen, on-demand booking flow, map screen. Socket.io WebSocket server for live dispatch events.</w:t>
             </w:r>
           </w:p>
         </w:tc>
@@ -4563,7 +4563,7 @@
                 <w:color w:val="111827"/>
                 <w:sz w:val="18"/>
               </w:rPr>
-              <w:t>Next.js website: homepage with city validator, service matrix cards, subscription tier comparison. Admin panel foundation: NestJS API, RBAC, role-based dashboards.</w:t>
+              <w:t>React.js (Next.js) website: homepage with city validator, service matrix cards, subscription tier comparison. Admin panel foundation: NestJS API, RBAC, role-based dashboards.</w:t>
             </w:r>
           </w:p>
         </w:tc>
@@ -4791,7 +4791,7 @@
                 <w:color w:val="111827"/>
                 <w:sz w:val="18"/>
               </w:rPr>
-              <w:t>Full end-to-end integration testing, bug fixing, performance optimization. React Native build preparation for App Store + Google Play.</w:t>
+              <w:t>Full end-to-end integration testing, bug fixing, performance optimization. Flutter build preparation for App Store + Google Play.</w:t>
             </w:r>
           </w:p>
         </w:tc>
@@ -5055,7 +5055,7 @@
                 <w:color w:val="111827"/>
                 <w:sz w:val="18"/>
               </w:rPr>
-              <w:t>React Native Customer App — booking flows, live tracking, subscription dashboard, push notifications, payment UI</w:t>
+              <w:t>Flutter Customer App — booking flows, live tracking, subscription dashboard, push notifications, payment UI</w:t>
             </w:r>
           </w:p>
         </w:tc>
@@ -5111,7 +5111,7 @@
                 <w:color w:val="111827"/>
                 <w:sz w:val="18"/>
               </w:rPr>
-              <w:t>React Native Worker App — dispatch radar, 30s timer, shift roster, GPS tracking, earnings dashboard</w:t>
+              <w:t>Flutter Worker App — dispatch radar, 30s timer, shift roster, GPS tracking, earnings dashboard</w:t>
             </w:r>
           </w:p>
         </w:tc>
@@ -5167,7 +5167,7 @@
                 <w:color w:val="111827"/>
                 <w:sz w:val="18"/>
               </w:rPr>
-              <w:t>Next.js Website + Admin Command Center — all web surfaces, SEO engine, Tailwind CSS design system</w:t>
+              <w:t>React.js (Next.js) Website + Admin Command Center — all web surfaces, SEO engine, Tailwind CSS design system</w:t>
             </w:r>
           </w:p>
         </w:tc>
@@ -5550,7 +5550,7 @@
                 <w:color w:val="111827"/>
                 <w:sz w:val="18"/>
               </w:rPr>
-              <w:t>React Native Customer App (iOS + Android)</w:t>
+              <w:t>Flutter Customer App (iOS + Android)</w:t>
             </w:r>
           </w:p>
         </w:tc>
@@ -5606,7 +5606,7 @@
                 <w:color w:val="111827"/>
                 <w:sz w:val="18"/>
               </w:rPr>
-              <w:t>React Native Worker App (iOS + Android, dual mode)</w:t>
+              <w:t>Flutter Worker App (iOS + Android, dual mode)</w:t>
             </w:r>
           </w:p>
         </w:tc>
@@ -5662,7 +5662,7 @@
                 <w:color w:val="111827"/>
                 <w:sz w:val="18"/>
               </w:rPr>
-              <w:t>Next.js 14 Marketing Website + SEO Engine</w:t>
+              <w:t>React.js (Next.js 14) Marketing Website + SEO Engine</w:t>
             </w:r>
           </w:p>
         </w:tc>
@@ -5718,7 +5718,7 @@
                 <w:color w:val="111827"/>
                 <w:sz w:val="18"/>
               </w:rPr>
-              <w:t>Admin Command Center (Next.js + NestJS)</w:t>
+              <w:t>Admin Command Center (React.js (Next.js) + NestJS)</w:t>
             </w:r>
           </w:p>
         </w:tc>
@@ -7448,7 +7448,7 @@
                 <w:color w:val="111827"/>
                 <w:sz w:val="18"/>
               </w:rPr>
-              <w:t>Development (NestJS API, React Native apps, Next.js web, Admin)</w:t>
+              <w:t>Development (NestJS API, Flutter apps, React.js (Next.js) web, Admin)</w:t>
             </w:r>
           </w:p>
         </w:tc>
@@ -8160,7 +8160,7 @@
         <w:rPr>
           <w:sz w:val="22"/>
         </w:rPr>
-        <w:t xml:space="preserve">   •  Marketing &amp; SEO Website  (Next.js 14) — city-specific landing pages, subscription checkout, B2B portal</w:t>
+        <w:t xml:space="preserve">   •  Marketing &amp; SEO Website  (React.js (Next.js 14)) — city-specific landing pages, subscription checkout, B2B portal</w:t>
       </w:r>
     </w:p>
     <w:p>
@@ -8432,7 +8432,7 @@
           <w:p>
             <w:r>
               <w:rPr/>
-              <w:t xml:space="preserve">Next.js SEO website</w:t>
+              <w:t>React.js (Next.js) SEO website</w:t>
             </w:r>
           </w:p>
         </w:tc>
@@ -9050,7 +9050,7 @@
                 <w:color w:val="111827"/>
                 <w:sz w:val="18"/>
               </w:rPr>
-              <w:t>Next.js website live on staging with SEO pages. Full admin command center with dispatch engine</w:t>
+              <w:t>React.js (Next.js) website live on staging with SEO pages. Full admin command center with dispatch engine</w:t>
             </w:r>
           </w:p>
         </w:tc>
@@ -9453,7 +9453,7 @@
                 <w:color w:val="111827"/>
                 <w:sz w:val="18"/>
               </w:rPr>
-              <w:t>React Native + Node.js + PostgreSQL</w:t>
+              <w:t>Flutter + Node.js + PostgreSQL</w:t>
             </w:r>
           </w:p>
         </w:tc>
@@ -9471,7 +9471,7 @@
                 <w:color w:val="111827"/>
                 <w:sz w:val="18"/>
               </w:rPr>
-              <w:t>Shared JS/TS monorepo. 60% code reuse between apps &amp; web.</w:t>
+              <w:t>Shared monorepo (Flutter + React.js). 60% code reuse between apps &amp; web.</w:t>
             </w:r>
           </w:p>
         </w:tc>
@@ -9527,7 +9527,7 @@
                 <w:color w:val="111827"/>
                 <w:sz w:val="18"/>
               </w:rPr>
-              <w:t>Next.js 14 with SSR + ISR</w:t>
+              <w:t>React.js (Next.js 14) with SSR + ISR</w:t>
             </w:r>
           </w:p>
         </w:tc>

</xml_diff>